<commit_message>
feat: add 5-question behavioral presentation demo preset and simplified resume
</commit_message>
<xml_diff>
--- a/public/demo-resume.docx
+++ b/public/demo-resume.docx
@@ -4,431 +4,184 @@
   <w:body>
     <w:p>
       <w:pPr>
-        <w:spacing w:after="40"/>
-        <w:jc w:val="center"/>
+        <w:pStyle w:val="Title"/>
       </w:pPr>
       <w:r>
-        <w:rPr>
-          <w:rFonts w:ascii="Helvetica" w:hAnsi="Helvetica"/>
-          <w:b/>
-          <w:sz w:val="40"/>
-        </w:rPr>
-        <w:t>ALEX CHEN</w:t>
+        <w:t>Alex Chen</w:t>
+      </w:r>
+    </w:p>
+    <w:p>
+      <w:r>
+        <w:t>San Francisco, CA • alex.chen@example.com • (555) 234-5678 • github.com/alexchen • linkedin.com/in/alexchen</w:t>
       </w:r>
     </w:p>
     <w:p>
       <w:pPr>
-        <w:spacing w:after="200"/>
-        <w:jc w:val="center"/>
+        <w:pStyle w:val="Heading1"/>
       </w:pPr>
       <w:r>
+        <w:t>Education</w:t>
+      </w:r>
+    </w:p>
+    <w:p>
+      <w:r>
         <w:rPr>
-          <w:color w:val="5A5A5A"/>
-          <w:sz w:val="19"/>
+          <w:b/>
         </w:rPr>
-        <w:t>alex.chen@example.com  •  +1 (555) 234-5678  •  github.com/alexchen  •  linkedin.com/in/alexchen-dev</w:t>
+        <w:t>State University — B.S. in Computer Science (GPA: 3.8 / 4.0)</w:t>
+        <w:br/>
+      </w:r>
+      <w:r>
+        <w:t>Graduated May 2025 • Relevant Coursework: Data Structures, Web Applications, Database Systems, Software Design</w:t>
       </w:r>
     </w:p>
     <w:p>
       <w:pPr>
-        <w:spacing w:before="160" w:after="60"/>
+        <w:pStyle w:val="Heading1"/>
       </w:pPr>
+      <w:r>
+        <w:t>Technical Skills</w:t>
+      </w:r>
+    </w:p>
+    <w:p>
       <w:r>
         <w:rPr>
           <w:b/>
-          <w:color w:val="141414"/>
-          <w:sz w:val="22"/>
         </w:rPr>
-        <w:t>EDUCATION</w:t>
+        <w:t xml:space="preserve">Languages: </w:t>
+      </w:r>
+      <w:r>
+        <w:t>TypeScript, JavaScript, Python, SQL, HTML5, CSS3</w:t>
+        <w:br/>
+      </w:r>
+      <w:r>
+        <w:rPr>
+          <w:b/>
+        </w:rPr>
+        <w:t xml:space="preserve">Frameworks &amp; Tools: </w:t>
+      </w:r>
+      <w:r>
+        <w:t>React, Next.js, Node.js, Express, PostgreSQL, Git, Tailwind CSS, Jest, Docker</w:t>
       </w:r>
     </w:p>
     <w:p>
       <w:pPr>
-        <w:spacing w:after="20"/>
+        <w:pStyle w:val="Heading1"/>
       </w:pPr>
+      <w:r>
+        <w:t>Featured Projects</w:t>
+      </w:r>
+    </w:p>
+    <w:p>
       <w:r>
         <w:rPr>
           <w:b/>
-          <w:sz w:val="20"/>
         </w:rPr>
-        <w:t>Bachelor of Technology in Computer Science and Engineering</w:t>
+        <w:t>TaskFlow — Team Task Management Web App (React, Node.js, PostgreSQL)</w:t>
         <w:br/>
-      </w:r>
-      <w:r>
-        <w:rPr>
-          <w:color w:val="505050"/>
-          <w:sz w:val="19"/>
-        </w:rPr>
-        <w:t>Chitkara University  |  CGPA: 9.2 / 10.0  |  Expected Graduation: June 2027</w:t>
-      </w:r>
-    </w:p>
-    <w:p>
-      <w:pPr>
-        <w:spacing w:before="160" w:after="60"/>
-      </w:pPr>
-      <w:r>
-        <w:rPr>
-          <w:b/>
-          <w:color w:val="141414"/>
-          <w:sz w:val="22"/>
-        </w:rPr>
-        <w:t>TECHNICAL SKILLS</w:t>
-      </w:r>
-    </w:p>
-    <w:p>
-      <w:pPr>
-        <w:spacing w:after="40"/>
-      </w:pPr>
-    </w:p>
-    <w:p>
-      <w:pPr>
-        <w:spacing w:before="20" w:after="20"/>
-      </w:pPr>
-      <w:r>
-        <w:rPr>
-          <w:b/>
-          <w:sz w:val="19"/>
-        </w:rPr>
-        <w:t xml:space="preserve">Languages: </w:t>
-      </w:r>
-      <w:r>
-        <w:rPr>
-          <w:sz w:val="19"/>
-        </w:rPr>
-        <w:t>TypeScript, JavaScript (ES6+), Python, Go, SQL (PostgreSQL, MySQL)</w:t>
-      </w:r>
-    </w:p>
-    <w:p>
-      <w:pPr>
-        <w:spacing w:before="20" w:after="20"/>
-      </w:pPr>
-      <w:r>
-        <w:rPr>
-          <w:b/>
-          <w:sz w:val="19"/>
-        </w:rPr>
-        <w:t xml:space="preserve">Backend &amp; Systems: </w:t>
-      </w:r>
-      <w:r>
-        <w:rPr>
-          <w:sz w:val="19"/>
-        </w:rPr>
-        <w:t>Node.js, Express, REST APIs, GraphQL, Redis, Distributed Systems, Microservices</w:t>
-      </w:r>
-    </w:p>
-    <w:p>
-      <w:pPr>
-        <w:spacing w:before="20" w:after="20"/>
-      </w:pPr>
-      <w:r>
-        <w:rPr>
-          <w:b/>
-          <w:sz w:val="19"/>
-        </w:rPr>
-        <w:t xml:space="preserve">Frontend: </w:t>
-      </w:r>
-      <w:r>
-        <w:rPr>
-          <w:sz w:val="19"/>
-        </w:rPr>
-        <w:t>React.js, Next.js (App Router), Tailwind CSS, Framer Motion, HTML5/CSS3</w:t>
-      </w:r>
-    </w:p>
-    <w:p>
-      <w:pPr>
-        <w:spacing w:before="20" w:after="20"/>
-      </w:pPr>
-      <w:r>
-        <w:rPr>
-          <w:b/>
-          <w:sz w:val="19"/>
-        </w:rPr>
-        <w:t xml:space="preserve">Cloud &amp; DevOps: </w:t>
-      </w:r>
-      <w:r>
-        <w:rPr>
-          <w:sz w:val="19"/>
-        </w:rPr>
-        <w:t>Microsoft Azure, Docker, Kubernetes, Git, CI/CD (GitHub Actions), Vitest, Jest</w:t>
-      </w:r>
-    </w:p>
-    <w:p>
-      <w:pPr>
-        <w:spacing w:before="160" w:after="60"/>
-      </w:pPr>
-      <w:r>
-        <w:rPr>
-          <w:b/>
-          <w:color w:val="141414"/>
-          <w:sz w:val="22"/>
-        </w:rPr>
-        <w:t>ENGINEERING PROJECTS</w:t>
-      </w:r>
-    </w:p>
-    <w:p>
-      <w:pPr>
-        <w:spacing w:before="60" w:after="20"/>
-      </w:pPr>
-      <w:r>
-        <w:rPr>
-          <w:b/>
-          <w:sz w:val="20"/>
-        </w:rPr>
-        <w:t>Distributed Order &amp; Inventory Processing Platform</w:t>
-      </w:r>
-      <w:r>
-        <w:rPr>
-          <w:color w:val="646464"/>
-          <w:sz w:val="18"/>
-        </w:rPr>
-        <w:t xml:space="preserve">  |  Node.js, Express, TypeScript, PostgreSQL, Redis, Docker</w:t>
       </w:r>
     </w:p>
     <w:p>
       <w:pPr>
         <w:pStyle w:val="ListBullet"/>
-        <w:spacing w:before="20" w:after="40"/>
       </w:pPr>
       <w:r>
-        <w:rPr>
-          <w:b/>
-          <w:sz w:val="19"/>
-        </w:rPr>
-        <w:t xml:space="preserve">Database Schema &amp; Integrity: </w:t>
-      </w:r>
-      <w:r>
-        <w:rPr>
-          <w:sz w:val="19"/>
-        </w:rPr>
-        <w:t>Architected relational transaction schema in PostgreSQL with strict ACID guarantees, utilizing row-level locking (SELECT ... FOR UPDATE) to prevent double-booking during flash-sale concurrency spikes.</w:t>
+        <w:t>• Built a responsive full-stack task manager with real-time updates and user authentication.</w:t>
       </w:r>
     </w:p>
     <w:p>
       <w:pPr>
         <w:pStyle w:val="ListBullet"/>
-        <w:spacing w:before="20" w:after="40"/>
       </w:pPr>
       <w:r>
-        <w:rPr>
-          <w:b/>
-          <w:sz w:val="19"/>
-        </w:rPr>
-        <w:t xml:space="preserve">Caching &amp; Invalidation: </w:t>
-      </w:r>
-      <w:r>
-        <w:rPr>
-          <w:sz w:val="19"/>
-        </w:rPr>
-        <w:t>Integrated Redis read-through caching for high-traffic inventory endpoints, slashing average query response latency by 68% (from 145ms to 46ms) with atomic write-through invalidation.</w:t>
+        <w:t>• Designed clean PostgreSQL database schema for users, project boards, and task assignments.</w:t>
       </w:r>
     </w:p>
     <w:p>
       <w:pPr>
         <w:pStyle w:val="ListBullet"/>
-        <w:spacing w:before="20" w:after="40"/>
       </w:pPr>
+      <w:r>
+        <w:t>• Implemented drag-and-drop task organization and automated email notifications for upcoming deadlines.</w:t>
+      </w:r>
+    </w:p>
+    <w:p>
       <w:r>
         <w:rPr>
           <w:b/>
-          <w:sz w:val="19"/>
         </w:rPr>
-        <w:t xml:space="preserve">Fault Tolerance &amp; Queues: </w:t>
-      </w:r>
-      <w:r>
-        <w:rPr>
-          <w:sz w:val="19"/>
-        </w:rPr>
-        <w:t>Implemented asynchronous order fulfillment pipeline with dead-letter queue retries, processing 3,500+ simulated concurrent orders with zero data loss.</w:t>
-      </w:r>
-    </w:p>
-    <w:p>
-      <w:pPr>
-        <w:spacing w:before="80" w:after="20"/>
-      </w:pPr>
-      <w:r>
-        <w:rPr>
-          <w:b/>
-          <w:sz w:val="20"/>
-        </w:rPr>
-        <w:t>Real-Time High-Throughput Metrics Dashboard</w:t>
-      </w:r>
-      <w:r>
-        <w:rPr>
-          <w:color w:val="646464"/>
-          <w:sz w:val="18"/>
-        </w:rPr>
-        <w:t xml:space="preserve">  |  Next.js, React, WebSockets, Apache Kafka, InfluxDB</w:t>
+        <w:t>Campus Marketplace — Student Exchange Platform (TypeScript, React, Express)</w:t>
+        <w:br/>
       </w:r>
     </w:p>
     <w:p>
       <w:pPr>
         <w:pStyle w:val="ListBullet"/>
-        <w:spacing w:before="20" w:after="40"/>
       </w:pPr>
       <w:r>
-        <w:rPr>
-          <w:b/>
-          <w:sz w:val="19"/>
-        </w:rPr>
-        <w:t xml:space="preserve">Streaming Telemetry: </w:t>
-      </w:r>
-      <w:r>
-        <w:rPr>
-          <w:sz w:val="19"/>
-        </w:rPr>
-        <w:t>Engineered real-time browser visualizer handling 8,000+ incoming metric events/second over duplex WebSockets without DOM frame dropping (60 FPS).</w:t>
+        <w:t>• Developed an online student marketplace for buying and selling textbooks and course materials.</w:t>
       </w:r>
     </w:p>
     <w:p>
       <w:pPr>
         <w:pStyle w:val="ListBullet"/>
-        <w:spacing w:before="20" w:after="40"/>
       </w:pPr>
       <w:r>
-        <w:rPr>
-          <w:b/>
-          <w:sz w:val="19"/>
-        </w:rPr>
-        <w:t xml:space="preserve">State &amp; Aggregation: </w:t>
-      </w:r>
-      <w:r>
-        <w:rPr>
-          <w:sz w:val="19"/>
-        </w:rPr>
-        <w:t>Designed windowed client-side buffering and decimation algorithms to render time-series plots without memory leaks across prolonged sessions.</w:t>
-      </w:r>
-    </w:p>
-    <w:p>
-      <w:pPr>
-        <w:spacing w:before="80" w:after="20"/>
-      </w:pPr>
-      <w:r>
-        <w:rPr>
-          <w:b/>
-          <w:sz w:val="20"/>
-        </w:rPr>
-        <w:t>Rehearse — Voice-Driven AI Interview Coach</w:t>
-      </w:r>
-      <w:r>
-        <w:rPr>
-          <w:color w:val="646464"/>
-          <w:sz w:val="18"/>
-        </w:rPr>
-        <w:t xml:space="preserve">  |  Next.js 14, TypeScript, Azure Cognitive Speech, Azure OpenAI (GPT-4o)</w:t>
+        <w:t>• Created intuitive search filters by course, department, and condition, serving 500+ active campus users.</w:t>
       </w:r>
     </w:p>
     <w:p>
       <w:pPr>
         <w:pStyle w:val="ListBullet"/>
-        <w:spacing w:before="20" w:after="40"/>
       </w:pPr>
+      <w:r>
+        <w:t>• Integrated secure JWT session management and responsive mobile-first UI with Tailwind CSS.</w:t>
+      </w:r>
+    </w:p>
+    <w:p>
+      <w:pPr>
+        <w:pStyle w:val="Heading1"/>
+      </w:pPr>
+      <w:r>
+        <w:t>Work Experience</w:t>
+      </w:r>
+    </w:p>
+    <w:p>
       <w:r>
         <w:rPr>
           <w:b/>
-          <w:sz w:val="19"/>
         </w:rPr>
-        <w:t xml:space="preserve">Speech &amp; Reasoning Loop: </w:t>
-      </w:r>
-      <w:r>
-        <w:rPr>
-          <w:sz w:val="19"/>
-        </w:rPr>
-        <w:t>Integrated continuous Azure Speech-to-Text streaming and 24kHz Neural TTS with SSML prosody; connected to GPT-4o for contextual multi-turn technical trade-off probing.</w:t>
+        <w:t>TechCorp Solutions — Software Engineering Intern (June 2024 – August 2024)</w:t>
+        <w:br/>
       </w:r>
     </w:p>
     <w:p>
       <w:pPr>
         <w:pStyle w:val="ListBullet"/>
-        <w:spacing w:before="20" w:after="40"/>
       </w:pPr>
       <w:r>
-        <w:rPr>
-          <w:b/>
-          <w:sz w:val="19"/>
-        </w:rPr>
-        <w:t xml:space="preserve">Responsible AI Architecture: </w:t>
-      </w:r>
-      <w:r>
-        <w:rPr>
-          <w:sz w:val="19"/>
-        </w:rPr>
-        <w:t>Architected zero-cloud local WebRTC camera stream for 100% video privacy and serverless ephemeral STS token authentication.</w:t>
-      </w:r>
-    </w:p>
-    <w:p>
-      <w:pPr>
-        <w:spacing w:before="160" w:after="60"/>
-      </w:pPr>
-      <w:r>
-        <w:rPr>
-          <w:b/>
-          <w:color w:val="141414"/>
-          <w:sz w:val="22"/>
-        </w:rPr>
-        <w:t>EXPERIENCE</w:t>
-      </w:r>
-    </w:p>
-    <w:p>
-      <w:pPr>
-        <w:spacing w:before="60" w:after="20"/>
-      </w:pPr>
-      <w:r>
-        <w:rPr>
-          <w:b/>
-          <w:sz w:val="20"/>
-        </w:rPr>
-        <w:t>Software Engineering Intern  |  CloudTech Innovations</w:t>
-      </w:r>
-      <w:r>
-        <w:rPr>
-          <w:color w:val="646464"/>
-          <w:sz w:val="18"/>
-        </w:rPr>
-        <w:br/>
-        <w:t>May 2025 – August 2025  |  Remote / Bangalore</w:t>
+        <w:t>• Developed and tested customer-facing dashboard features in React and TypeScript.</w:t>
       </w:r>
     </w:p>
     <w:p>
       <w:pPr>
         <w:pStyle w:val="ListBullet"/>
-        <w:spacing w:before="20" w:after="40"/>
       </w:pPr>
       <w:r>
-        <w:rPr>
-          <w:b/>
-          <w:sz w:val="19"/>
-        </w:rPr>
-        <w:t xml:space="preserve">API Optimization: </w:t>
-      </w:r>
-      <w:r>
-        <w:rPr>
-          <w:sz w:val="19"/>
-        </w:rPr>
-        <w:t>Refactored 14 core REST endpoints, implementing query pagination and Redis caching that cut P95 latency from 320ms to 95ms.</w:t>
+        <w:t>• Collaborated in weekly agile standups and sprint planning to deliver features on schedule.</w:t>
       </w:r>
     </w:p>
     <w:p>
       <w:pPr>
         <w:pStyle w:val="ListBullet"/>
-        <w:spacing w:before="20" w:after="40"/>
       </w:pPr>
       <w:r>
-        <w:rPr>
-          <w:b/>
-          <w:sz w:val="19"/>
-        </w:rPr>
-        <w:t xml:space="preserve">CI/CD &amp; Testing: </w:t>
-      </w:r>
-      <w:r>
-        <w:rPr>
-          <w:sz w:val="19"/>
-        </w:rPr>
-        <w:t>Authored automated unit and integration test suites achieving 88% branch coverage, reducing production hotfix releases by 40%.</w:t>
+        <w:t>• Wrote unit and integration tests using Jest, maintaining 85% test coverage across core components.</w:t>
       </w:r>
     </w:p>
     <w:sectPr>
       <w:pgSz w:w="12240" w:h="15840"/>
-      <w:pgMar w:top="720" w:right="864" w:bottom="720" w:left="864" w:header="720" w:footer="720" w:gutter="0"/>
+      <w:pgMar w:top="1440" w:right="1800" w:bottom="1440" w:left="1800" w:header="720" w:footer="720" w:gutter="0"/>
       <w:cols w:space="720"/>
       <w:docGrid w:linePitch="360"/>
     </w:sectPr>

</xml_diff>